<commit_message>
Make generated resources cross-runtime deterministic
</commit_message>
<xml_diff>
--- a/assets/downloads/30-60-90-egitim-etkinlik-raporu-v1.docx
+++ b/assets/downloads/30-60-90-egitim-etkinlik-raporu-v1.docx
@@ -1,6 +1,6 @@
 
 <file path=word/document.xml><?xml version="1.0" encoding="utf-8"?>
-<w:document xmlns:wpc="http://schemas.microsoft.com/office/word/2010/wordprocessingCanvas" xmlns:mc="http://schemas.openxmlformats.org/markup-compatibility/2006" xmlns:o="urn:schemas-microsoft-com:office:office" xmlns:r="http://schemas.openxmlformats.org/officeDocument/2006/relationships" xmlns:m="http://schemas.openxmlformats.org/officeDocument/2006/math" xmlns:v="urn:schemas-microsoft-com:vml" xmlns:wp14="http://schemas.microsoft.com/office/word/2010/wordprocessingDrawing" xmlns:wp="http://schemas.openxmlformats.org/drawingml/2006/wordprocessingDrawing" xmlns:w10="urn:schemas-microsoft-com:office:word" xmlns:w="http://schemas.openxmlformats.org/wordprocessingml/2006/main" xmlns:w14="http://schemas.microsoft.com/office/word/2010/wordml" xmlns:w15="http://schemas.microsoft.com/office/word/2012/wordml" xmlns:wpg="http://schemas.microsoft.com/office/word/2010/wordprocessingGroup" xmlns:wpi="http://schemas.microsoft.com/office/word/2010/wordprocessingInk" xmlns:wne="http://schemas.microsoft.com/office/word/2006/wordml" xmlns:wps="http://schemas.microsoft.com/office/word/2010/wordprocessingShape" xmlns:cx="http://schemas.microsoft.com/office/drawing/2014/chartex" xmlns:cx1="http://schemas.microsoft.com/office/drawing/2015/9/8/chartex" xmlns:cx2="http://schemas.microsoft.com/office/drawing/2015/10/21/chartex" xmlns:cx3="http://schemas.microsoft.com/office/drawing/2016/5/9/chartex" xmlns:cx4="http://schemas.microsoft.com/office/drawing/2016/5/10/chartex" xmlns:cx5="http://schemas.microsoft.com/office/drawing/2016/5/11/chartex" xmlns:cx6="http://schemas.microsoft.com/office/drawing/2016/5/12/chartex" xmlns:cx7="http://schemas.microsoft.com/office/drawing/2016/5/13/chartex" xmlns:cx8="http://schemas.microsoft.com/office/drawing/2016/5/14/chartex" xmlns:aink="http://schemas.microsoft.com/office/drawing/2016/ink" xmlns:am3d="http://schemas.microsoft.com/office/drawing/2017/model3d" xmlns:w16cex="http://schemas.microsoft.com/office/word/2018/wordml/cex" xmlns:w16cid="http://schemas.microsoft.com/office/word/2016/wordml/cid" xmlns:w16="http://schemas.microsoft.com/office/word/2018/wordml" xmlns:w16sdtdh="http://schemas.microsoft.com/office/word/2020/wordml/sdtdatahash" xmlns:w16se="http://schemas.microsoft.com/office/word/2015/wordml/symex" mc:Ignorable="w14 w15 wp14">
+<w:document xmlns:mc="http://schemas.openxmlformats.org/markup-compatibility/2006" xmlns:w="http://schemas.openxmlformats.org/wordprocessingml/2006/main" mc:Ignorable="w14 w15 wp14">
   <w:body>
     <w:p>
       <w:pPr>
@@ -58,12 +58,12 @@
       <w:tblPr>
         <w:tblW w:type="dxa" w:w="9026"/>
         <w:tblBorders>
-          <w:top w:val="single" w:color="auto" w:sz="4"/>
-          <w:left w:val="single" w:color="auto" w:sz="4"/>
-          <w:bottom w:val="single" w:color="auto" w:sz="4"/>
-          <w:right w:val="single" w:color="auto" w:sz="4"/>
-          <w:insideH w:val="single" w:color="auto" w:sz="4"/>
-          <w:insideV w:val="single" w:color="auto" w:sz="4"/>
+          <w:top w:color="auto" w:sz="4" w:val="single"/>
+          <w:left w:color="auto" w:sz="4" w:val="single"/>
+          <w:bottom w:color="auto" w:sz="4" w:val="single"/>
+          <w:right w:color="auto" w:sz="4" w:val="single"/>
+          <w:insideH w:color="auto" w:sz="4" w:val="single"/>
+          <w:insideV w:color="auto" w:sz="4" w:val="single"/>
         </w:tblBorders>
       </w:tblPr>
       <w:tblGrid>
@@ -77,10 +77,10 @@
           <w:tcPr>
             <w:tcW w:type="dxa" w:w="1550"/>
             <w:tcBorders>
-              <w:top w:val="single" w:color="B7CFDA" w:sz="4"/>
-              <w:left w:val="single" w:color="B7CFDA" w:sz="4"/>
-              <w:bottom w:val="single" w:color="B7CFDA" w:sz="4"/>
-              <w:right w:val="single" w:color="B7CFDA" w:sz="4"/>
+              <w:top w:color="B7CFDA" w:sz="4" w:val="single"/>
+              <w:left w:color="B7CFDA" w:sz="4" w:val="single"/>
+              <w:bottom w:color="B7CFDA" w:sz="4" w:val="single"/>
+              <w:right w:color="B7CFDA" w:sz="4" w:val="single"/>
             </w:tcBorders>
             <w:shd w:fill="F4F8FB" w:val="clear"/>
             <w:tcMar>
@@ -112,10 +112,10 @@
           <w:tcPr>
             <w:tcW w:type="dxa" w:w="2963"/>
             <w:tcBorders>
-              <w:top w:val="single" w:color="B7CFDA" w:sz="4"/>
-              <w:left w:val="single" w:color="B7CFDA" w:sz="4"/>
-              <w:bottom w:val="single" w:color="B7CFDA" w:sz="4"/>
-              <w:right w:val="single" w:color="B7CFDA" w:sz="4"/>
+              <w:top w:color="B7CFDA" w:sz="4" w:val="single"/>
+              <w:left w:color="B7CFDA" w:sz="4" w:val="single"/>
+              <w:bottom w:color="B7CFDA" w:sz="4" w:val="single"/>
+              <w:right w:color="B7CFDA" w:sz="4" w:val="single"/>
             </w:tcBorders>
             <w:shd w:fill="FFF2CC" w:val="clear"/>
             <w:tcMar>
@@ -147,10 +147,10 @@
           <w:tcPr>
             <w:tcW w:type="dxa" w:w="1550"/>
             <w:tcBorders>
-              <w:top w:val="single" w:color="B7CFDA" w:sz="4"/>
-              <w:left w:val="single" w:color="B7CFDA" w:sz="4"/>
-              <w:bottom w:val="single" w:color="B7CFDA" w:sz="4"/>
-              <w:right w:val="single" w:color="B7CFDA" w:sz="4"/>
+              <w:top w:color="B7CFDA" w:sz="4" w:val="single"/>
+              <w:left w:color="B7CFDA" w:sz="4" w:val="single"/>
+              <w:bottom w:color="B7CFDA" w:sz="4" w:val="single"/>
+              <w:right w:color="B7CFDA" w:sz="4" w:val="single"/>
             </w:tcBorders>
             <w:shd w:fill="F4F8FB" w:val="clear"/>
             <w:tcMar>
@@ -182,10 +182,10 @@
           <w:tcPr>
             <w:tcW w:type="dxa" w:w="2963"/>
             <w:tcBorders>
-              <w:top w:val="single" w:color="B7CFDA" w:sz="4"/>
-              <w:left w:val="single" w:color="B7CFDA" w:sz="4"/>
-              <w:bottom w:val="single" w:color="B7CFDA" w:sz="4"/>
-              <w:right w:val="single" w:color="B7CFDA" w:sz="4"/>
+              <w:top w:color="B7CFDA" w:sz="4" w:val="single"/>
+              <w:left w:color="B7CFDA" w:sz="4" w:val="single"/>
+              <w:bottom w:color="B7CFDA" w:sz="4" w:val="single"/>
+              <w:right w:color="B7CFDA" w:sz="4" w:val="single"/>
             </w:tcBorders>
             <w:shd w:fill="FFF2CC" w:val="clear"/>
             <w:tcMar>
@@ -219,10 +219,10 @@
           <w:tcPr>
             <w:tcW w:type="dxa" w:w="1550"/>
             <w:tcBorders>
-              <w:top w:val="single" w:color="B7CFDA" w:sz="4"/>
-              <w:left w:val="single" w:color="B7CFDA" w:sz="4"/>
-              <w:bottom w:val="single" w:color="B7CFDA" w:sz="4"/>
-              <w:right w:val="single" w:color="B7CFDA" w:sz="4"/>
+              <w:top w:color="B7CFDA" w:sz="4" w:val="single"/>
+              <w:left w:color="B7CFDA" w:sz="4" w:val="single"/>
+              <w:bottom w:color="B7CFDA" w:sz="4" w:val="single"/>
+              <w:right w:color="B7CFDA" w:sz="4" w:val="single"/>
             </w:tcBorders>
             <w:shd w:fill="F4F8FB" w:val="clear"/>
             <w:tcMar>
@@ -254,10 +254,10 @@
           <w:tcPr>
             <w:tcW w:type="dxa" w:w="2963"/>
             <w:tcBorders>
-              <w:top w:val="single" w:color="B7CFDA" w:sz="4"/>
-              <w:left w:val="single" w:color="B7CFDA" w:sz="4"/>
-              <w:bottom w:val="single" w:color="B7CFDA" w:sz="4"/>
-              <w:right w:val="single" w:color="B7CFDA" w:sz="4"/>
+              <w:top w:color="B7CFDA" w:sz="4" w:val="single"/>
+              <w:left w:color="B7CFDA" w:sz="4" w:val="single"/>
+              <w:bottom w:color="B7CFDA" w:sz="4" w:val="single"/>
+              <w:right w:color="B7CFDA" w:sz="4" w:val="single"/>
             </w:tcBorders>
             <w:shd w:fill="FFF2CC" w:val="clear"/>
             <w:tcMar>
@@ -289,10 +289,10 @@
           <w:tcPr>
             <w:tcW w:type="dxa" w:w="1550"/>
             <w:tcBorders>
-              <w:top w:val="single" w:color="B7CFDA" w:sz="4"/>
-              <w:left w:val="single" w:color="B7CFDA" w:sz="4"/>
-              <w:bottom w:val="single" w:color="B7CFDA" w:sz="4"/>
-              <w:right w:val="single" w:color="B7CFDA" w:sz="4"/>
+              <w:top w:color="B7CFDA" w:sz="4" w:val="single"/>
+              <w:left w:color="B7CFDA" w:sz="4" w:val="single"/>
+              <w:bottom w:color="B7CFDA" w:sz="4" w:val="single"/>
+              <w:right w:color="B7CFDA" w:sz="4" w:val="single"/>
             </w:tcBorders>
             <w:shd w:fill="F4F8FB" w:val="clear"/>
             <w:tcMar>
@@ -324,10 +324,10 @@
           <w:tcPr>
             <w:tcW w:type="dxa" w:w="2963"/>
             <w:tcBorders>
-              <w:top w:val="single" w:color="B7CFDA" w:sz="4"/>
-              <w:left w:val="single" w:color="B7CFDA" w:sz="4"/>
-              <w:bottom w:val="single" w:color="B7CFDA" w:sz="4"/>
-              <w:right w:val="single" w:color="B7CFDA" w:sz="4"/>
+              <w:top w:color="B7CFDA" w:sz="4" w:val="single"/>
+              <w:left w:color="B7CFDA" w:sz="4" w:val="single"/>
+              <w:bottom w:color="B7CFDA" w:sz="4" w:val="single"/>
+              <w:right w:color="B7CFDA" w:sz="4" w:val="single"/>
             </w:tcBorders>
             <w:shd w:fill="FFF2CC" w:val="clear"/>
             <w:tcMar>
@@ -396,12 +396,12 @@
       <w:tblPr>
         <w:tblW w:type="dxa" w:w="9026"/>
         <w:tblBorders>
-          <w:top w:val="single" w:color="auto" w:sz="4"/>
-          <w:left w:val="single" w:color="auto" w:sz="4"/>
-          <w:bottom w:val="single" w:color="auto" w:sz="4"/>
-          <w:right w:val="single" w:color="auto" w:sz="4"/>
-          <w:insideH w:val="single" w:color="auto" w:sz="4"/>
-          <w:insideV w:val="single" w:color="auto" w:sz="4"/>
+          <w:top w:color="auto" w:sz="4" w:val="single"/>
+          <w:left w:color="auto" w:sz="4" w:val="single"/>
+          <w:bottom w:color="auto" w:sz="4" w:val="single"/>
+          <w:right w:color="auto" w:sz="4" w:val="single"/>
+          <w:insideH w:color="auto" w:sz="4" w:val="single"/>
+          <w:insideV w:color="auto" w:sz="4" w:val="single"/>
         </w:tblBorders>
       </w:tblPr>
       <w:tblGrid>
@@ -418,10 +418,10 @@
           <w:tcPr>
             <w:tcW w:type="dxa" w:w="1500"/>
             <w:tcBorders>
-              <w:top w:val="single" w:color="B7CFDA" w:sz="4"/>
-              <w:left w:val="single" w:color="B7CFDA" w:sz="4"/>
-              <w:bottom w:val="single" w:color="B7CFDA" w:sz="4"/>
-              <w:right w:val="single" w:color="B7CFDA" w:sz="4"/>
+              <w:top w:color="B7CFDA" w:sz="4" w:val="single"/>
+              <w:left w:color="B7CFDA" w:sz="4" w:val="single"/>
+              <w:bottom w:color="B7CFDA" w:sz="4" w:val="single"/>
+              <w:right w:color="B7CFDA" w:sz="4" w:val="single"/>
             </w:tcBorders>
             <w:shd w:fill="185A77" w:val="clear"/>
             <w:tcMar>
@@ -453,10 +453,10 @@
           <w:tcPr>
             <w:tcW w:type="dxa" w:w="3350"/>
             <w:tcBorders>
-              <w:top w:val="single" w:color="B7CFDA" w:sz="4"/>
-              <w:left w:val="single" w:color="B7CFDA" w:sz="4"/>
-              <w:bottom w:val="single" w:color="B7CFDA" w:sz="4"/>
-              <w:right w:val="single" w:color="B7CFDA" w:sz="4"/>
+              <w:top w:color="B7CFDA" w:sz="4" w:val="single"/>
+              <w:left w:color="B7CFDA" w:sz="4" w:val="single"/>
+              <w:bottom w:color="B7CFDA" w:sz="4" w:val="single"/>
+              <w:right w:color="B7CFDA" w:sz="4" w:val="single"/>
             </w:tcBorders>
             <w:shd w:fill="185A77" w:val="clear"/>
             <w:tcMar>
@@ -488,10 +488,10 @@
           <w:tcPr>
             <w:tcW w:type="dxa" w:w="2250"/>
             <w:tcBorders>
-              <w:top w:val="single" w:color="B7CFDA" w:sz="4"/>
-              <w:left w:val="single" w:color="B7CFDA" w:sz="4"/>
-              <w:bottom w:val="single" w:color="B7CFDA" w:sz="4"/>
-              <w:right w:val="single" w:color="B7CFDA" w:sz="4"/>
+              <w:top w:color="B7CFDA" w:sz="4" w:val="single"/>
+              <w:left w:color="B7CFDA" w:sz="4" w:val="single"/>
+              <w:bottom w:color="B7CFDA" w:sz="4" w:val="single"/>
+              <w:right w:color="B7CFDA" w:sz="4" w:val="single"/>
             </w:tcBorders>
             <w:shd w:fill="185A77" w:val="clear"/>
             <w:tcMar>
@@ -523,10 +523,10 @@
           <w:tcPr>
             <w:tcW w:type="dxa" w:w="1926"/>
             <w:tcBorders>
-              <w:top w:val="single" w:color="B7CFDA" w:sz="4"/>
-              <w:left w:val="single" w:color="B7CFDA" w:sz="4"/>
-              <w:bottom w:val="single" w:color="B7CFDA" w:sz="4"/>
-              <w:right w:val="single" w:color="B7CFDA" w:sz="4"/>
+              <w:top w:color="B7CFDA" w:sz="4" w:val="single"/>
+              <w:left w:color="B7CFDA" w:sz="4" w:val="single"/>
+              <w:bottom w:color="B7CFDA" w:sz="4" w:val="single"/>
+              <w:right w:color="B7CFDA" w:sz="4" w:val="single"/>
             </w:tcBorders>
             <w:shd w:fill="185A77" w:val="clear"/>
             <w:tcMar>
@@ -560,10 +560,10 @@
           <w:tcPr>
             <w:tcW w:type="dxa" w:w="1500"/>
             <w:tcBorders>
-              <w:top w:val="single" w:color="B7CFDA" w:sz="4"/>
-              <w:left w:val="single" w:color="B7CFDA" w:sz="4"/>
-              <w:bottom w:val="single" w:color="B7CFDA" w:sz="4"/>
-              <w:right w:val="single" w:color="B7CFDA" w:sz="4"/>
+              <w:top w:color="B7CFDA" w:sz="4" w:val="single"/>
+              <w:left w:color="B7CFDA" w:sz="4" w:val="single"/>
+              <w:bottom w:color="B7CFDA" w:sz="4" w:val="single"/>
+              <w:right w:color="B7CFDA" w:sz="4" w:val="single"/>
             </w:tcBorders>
             <w:shd w:fill="FFFFFF" w:val="clear"/>
             <w:tcMar>
@@ -595,10 +595,10 @@
           <w:tcPr>
             <w:tcW w:type="dxa" w:w="3350"/>
             <w:tcBorders>
-              <w:top w:val="single" w:color="B7CFDA" w:sz="4"/>
-              <w:left w:val="single" w:color="B7CFDA" w:sz="4"/>
-              <w:bottom w:val="single" w:color="B7CFDA" w:sz="4"/>
-              <w:right w:val="single" w:color="B7CFDA" w:sz="4"/>
+              <w:top w:color="B7CFDA" w:sz="4" w:val="single"/>
+              <w:left w:color="B7CFDA" w:sz="4" w:val="single"/>
+              <w:bottom w:color="B7CFDA" w:sz="4" w:val="single"/>
+              <w:right w:color="B7CFDA" w:sz="4" w:val="single"/>
             </w:tcBorders>
             <w:shd w:fill="FFFFFF" w:val="clear"/>
             <w:tcMar>
@@ -630,10 +630,10 @@
           <w:tcPr>
             <w:tcW w:type="dxa" w:w="2250"/>
             <w:tcBorders>
-              <w:top w:val="single" w:color="B7CFDA" w:sz="4"/>
-              <w:left w:val="single" w:color="B7CFDA" w:sz="4"/>
-              <w:bottom w:val="single" w:color="B7CFDA" w:sz="4"/>
-              <w:right w:val="single" w:color="B7CFDA" w:sz="4"/>
+              <w:top w:color="B7CFDA" w:sz="4" w:val="single"/>
+              <w:left w:color="B7CFDA" w:sz="4" w:val="single"/>
+              <w:bottom w:color="B7CFDA" w:sz="4" w:val="single"/>
+              <w:right w:color="B7CFDA" w:sz="4" w:val="single"/>
             </w:tcBorders>
             <w:shd w:fill="FFFFFF" w:val="clear"/>
             <w:tcMar>
@@ -665,10 +665,10 @@
           <w:tcPr>
             <w:tcW w:type="dxa" w:w="1926"/>
             <w:tcBorders>
-              <w:top w:val="single" w:color="B7CFDA" w:sz="4"/>
-              <w:left w:val="single" w:color="B7CFDA" w:sz="4"/>
-              <w:bottom w:val="single" w:color="B7CFDA" w:sz="4"/>
-              <w:right w:val="single" w:color="B7CFDA" w:sz="4"/>
+              <w:top w:color="B7CFDA" w:sz="4" w:val="single"/>
+              <w:left w:color="B7CFDA" w:sz="4" w:val="single"/>
+              <w:bottom w:color="B7CFDA" w:sz="4" w:val="single"/>
+              <w:right w:color="B7CFDA" w:sz="4" w:val="single"/>
             </w:tcBorders>
             <w:shd w:fill="FFF2CC" w:val="clear"/>
             <w:tcMar>
@@ -703,10 +703,10 @@
           <w:tcPr>
             <w:tcW w:type="dxa" w:w="1500"/>
             <w:tcBorders>
-              <w:top w:val="single" w:color="B7CFDA" w:sz="4"/>
-              <w:left w:val="single" w:color="B7CFDA" w:sz="4"/>
-              <w:bottom w:val="single" w:color="B7CFDA" w:sz="4"/>
-              <w:right w:val="single" w:color="B7CFDA" w:sz="4"/>
+              <w:top w:color="B7CFDA" w:sz="4" w:val="single"/>
+              <w:left w:color="B7CFDA" w:sz="4" w:val="single"/>
+              <w:bottom w:color="B7CFDA" w:sz="4" w:val="single"/>
+              <w:right w:color="B7CFDA" w:sz="4" w:val="single"/>
             </w:tcBorders>
             <w:shd w:fill="F4F8FB" w:val="clear"/>
             <w:tcMar>
@@ -738,10 +738,10 @@
           <w:tcPr>
             <w:tcW w:type="dxa" w:w="3350"/>
             <w:tcBorders>
-              <w:top w:val="single" w:color="B7CFDA" w:sz="4"/>
-              <w:left w:val="single" w:color="B7CFDA" w:sz="4"/>
-              <w:bottom w:val="single" w:color="B7CFDA" w:sz="4"/>
-              <w:right w:val="single" w:color="B7CFDA" w:sz="4"/>
+              <w:top w:color="B7CFDA" w:sz="4" w:val="single"/>
+              <w:left w:color="B7CFDA" w:sz="4" w:val="single"/>
+              <w:bottom w:color="B7CFDA" w:sz="4" w:val="single"/>
+              <w:right w:color="B7CFDA" w:sz="4" w:val="single"/>
             </w:tcBorders>
             <w:shd w:fill="F4F8FB" w:val="clear"/>
             <w:tcMar>
@@ -773,10 +773,10 @@
           <w:tcPr>
             <w:tcW w:type="dxa" w:w="2250"/>
             <w:tcBorders>
-              <w:top w:val="single" w:color="B7CFDA" w:sz="4"/>
-              <w:left w:val="single" w:color="B7CFDA" w:sz="4"/>
-              <w:bottom w:val="single" w:color="B7CFDA" w:sz="4"/>
-              <w:right w:val="single" w:color="B7CFDA" w:sz="4"/>
+              <w:top w:color="B7CFDA" w:sz="4" w:val="single"/>
+              <w:left w:color="B7CFDA" w:sz="4" w:val="single"/>
+              <w:bottom w:color="B7CFDA" w:sz="4" w:val="single"/>
+              <w:right w:color="B7CFDA" w:sz="4" w:val="single"/>
             </w:tcBorders>
             <w:shd w:fill="F4F8FB" w:val="clear"/>
             <w:tcMar>
@@ -808,10 +808,10 @@
           <w:tcPr>
             <w:tcW w:type="dxa" w:w="1926"/>
             <w:tcBorders>
-              <w:top w:val="single" w:color="B7CFDA" w:sz="4"/>
-              <w:left w:val="single" w:color="B7CFDA" w:sz="4"/>
-              <w:bottom w:val="single" w:color="B7CFDA" w:sz="4"/>
-              <w:right w:val="single" w:color="B7CFDA" w:sz="4"/>
+              <w:top w:color="B7CFDA" w:sz="4" w:val="single"/>
+              <w:left w:color="B7CFDA" w:sz="4" w:val="single"/>
+              <w:bottom w:color="B7CFDA" w:sz="4" w:val="single"/>
+              <w:right w:color="B7CFDA" w:sz="4" w:val="single"/>
             </w:tcBorders>
             <w:shd w:fill="FFF2CC" w:val="clear"/>
             <w:tcMar>
@@ -846,10 +846,10 @@
           <w:tcPr>
             <w:tcW w:type="dxa" w:w="1500"/>
             <w:tcBorders>
-              <w:top w:val="single" w:color="B7CFDA" w:sz="4"/>
-              <w:left w:val="single" w:color="B7CFDA" w:sz="4"/>
-              <w:bottom w:val="single" w:color="B7CFDA" w:sz="4"/>
-              <w:right w:val="single" w:color="B7CFDA" w:sz="4"/>
+              <w:top w:color="B7CFDA" w:sz="4" w:val="single"/>
+              <w:left w:color="B7CFDA" w:sz="4" w:val="single"/>
+              <w:bottom w:color="B7CFDA" w:sz="4" w:val="single"/>
+              <w:right w:color="B7CFDA" w:sz="4" w:val="single"/>
             </w:tcBorders>
             <w:shd w:fill="FFFFFF" w:val="clear"/>
             <w:tcMar>
@@ -881,10 +881,10 @@
           <w:tcPr>
             <w:tcW w:type="dxa" w:w="3350"/>
             <w:tcBorders>
-              <w:top w:val="single" w:color="B7CFDA" w:sz="4"/>
-              <w:left w:val="single" w:color="B7CFDA" w:sz="4"/>
-              <w:bottom w:val="single" w:color="B7CFDA" w:sz="4"/>
-              <w:right w:val="single" w:color="B7CFDA" w:sz="4"/>
+              <w:top w:color="B7CFDA" w:sz="4" w:val="single"/>
+              <w:left w:color="B7CFDA" w:sz="4" w:val="single"/>
+              <w:bottom w:color="B7CFDA" w:sz="4" w:val="single"/>
+              <w:right w:color="B7CFDA" w:sz="4" w:val="single"/>
             </w:tcBorders>
             <w:shd w:fill="FFFFFF" w:val="clear"/>
             <w:tcMar>
@@ -916,10 +916,10 @@
           <w:tcPr>
             <w:tcW w:type="dxa" w:w="2250"/>
             <w:tcBorders>
-              <w:top w:val="single" w:color="B7CFDA" w:sz="4"/>
-              <w:left w:val="single" w:color="B7CFDA" w:sz="4"/>
-              <w:bottom w:val="single" w:color="B7CFDA" w:sz="4"/>
-              <w:right w:val="single" w:color="B7CFDA" w:sz="4"/>
+              <w:top w:color="B7CFDA" w:sz="4" w:val="single"/>
+              <w:left w:color="B7CFDA" w:sz="4" w:val="single"/>
+              <w:bottom w:color="B7CFDA" w:sz="4" w:val="single"/>
+              <w:right w:color="B7CFDA" w:sz="4" w:val="single"/>
             </w:tcBorders>
             <w:shd w:fill="FFFFFF" w:val="clear"/>
             <w:tcMar>
@@ -951,10 +951,10 @@
           <w:tcPr>
             <w:tcW w:type="dxa" w:w="1926"/>
             <w:tcBorders>
-              <w:top w:val="single" w:color="B7CFDA" w:sz="4"/>
-              <w:left w:val="single" w:color="B7CFDA" w:sz="4"/>
-              <w:bottom w:val="single" w:color="B7CFDA" w:sz="4"/>
-              <w:right w:val="single" w:color="B7CFDA" w:sz="4"/>
+              <w:top w:color="B7CFDA" w:sz="4" w:val="single"/>
+              <w:left w:color="B7CFDA" w:sz="4" w:val="single"/>
+              <w:bottom w:color="B7CFDA" w:sz="4" w:val="single"/>
+              <w:right w:color="B7CFDA" w:sz="4" w:val="single"/>
             </w:tcBorders>
             <w:shd w:fill="FFF2CC" w:val="clear"/>
             <w:tcMar>
@@ -989,10 +989,10 @@
           <w:tcPr>
             <w:tcW w:type="dxa" w:w="1500"/>
             <w:tcBorders>
-              <w:top w:val="single" w:color="B7CFDA" w:sz="4"/>
-              <w:left w:val="single" w:color="B7CFDA" w:sz="4"/>
-              <w:bottom w:val="single" w:color="B7CFDA" w:sz="4"/>
-              <w:right w:val="single" w:color="B7CFDA" w:sz="4"/>
+              <w:top w:color="B7CFDA" w:sz="4" w:val="single"/>
+              <w:left w:color="B7CFDA" w:sz="4" w:val="single"/>
+              <w:bottom w:color="B7CFDA" w:sz="4" w:val="single"/>
+              <w:right w:color="B7CFDA" w:sz="4" w:val="single"/>
             </w:tcBorders>
             <w:shd w:fill="F4F8FB" w:val="clear"/>
             <w:tcMar>
@@ -1024,10 +1024,10 @@
           <w:tcPr>
             <w:tcW w:type="dxa" w:w="3350"/>
             <w:tcBorders>
-              <w:top w:val="single" w:color="B7CFDA" w:sz="4"/>
-              <w:left w:val="single" w:color="B7CFDA" w:sz="4"/>
-              <w:bottom w:val="single" w:color="B7CFDA" w:sz="4"/>
-              <w:right w:val="single" w:color="B7CFDA" w:sz="4"/>
+              <w:top w:color="B7CFDA" w:sz="4" w:val="single"/>
+              <w:left w:color="B7CFDA" w:sz="4" w:val="single"/>
+              <w:bottom w:color="B7CFDA" w:sz="4" w:val="single"/>
+              <w:right w:color="B7CFDA" w:sz="4" w:val="single"/>
             </w:tcBorders>
             <w:shd w:fill="F4F8FB" w:val="clear"/>
             <w:tcMar>
@@ -1059,10 +1059,10 @@
           <w:tcPr>
             <w:tcW w:type="dxa" w:w="2250"/>
             <w:tcBorders>
-              <w:top w:val="single" w:color="B7CFDA" w:sz="4"/>
-              <w:left w:val="single" w:color="B7CFDA" w:sz="4"/>
-              <w:bottom w:val="single" w:color="B7CFDA" w:sz="4"/>
-              <w:right w:val="single" w:color="B7CFDA" w:sz="4"/>
+              <w:top w:color="B7CFDA" w:sz="4" w:val="single"/>
+              <w:left w:color="B7CFDA" w:sz="4" w:val="single"/>
+              <w:bottom w:color="B7CFDA" w:sz="4" w:val="single"/>
+              <w:right w:color="B7CFDA" w:sz="4" w:val="single"/>
             </w:tcBorders>
             <w:shd w:fill="F4F8FB" w:val="clear"/>
             <w:tcMar>
@@ -1094,10 +1094,10 @@
           <w:tcPr>
             <w:tcW w:type="dxa" w:w="1926"/>
             <w:tcBorders>
-              <w:top w:val="single" w:color="B7CFDA" w:sz="4"/>
-              <w:left w:val="single" w:color="B7CFDA" w:sz="4"/>
-              <w:bottom w:val="single" w:color="B7CFDA" w:sz="4"/>
-              <w:right w:val="single" w:color="B7CFDA" w:sz="4"/>
+              <w:top w:color="B7CFDA" w:sz="4" w:val="single"/>
+              <w:left w:color="B7CFDA" w:sz="4" w:val="single"/>
+              <w:bottom w:color="B7CFDA" w:sz="4" w:val="single"/>
+              <w:right w:color="B7CFDA" w:sz="4" w:val="single"/>
             </w:tcBorders>
             <w:shd w:fill="FFF2CC" w:val="clear"/>
             <w:tcMar>
@@ -1132,10 +1132,10 @@
           <w:tcPr>
             <w:tcW w:type="dxa" w:w="1500"/>
             <w:tcBorders>
-              <w:top w:val="single" w:color="B7CFDA" w:sz="4"/>
-              <w:left w:val="single" w:color="B7CFDA" w:sz="4"/>
-              <w:bottom w:val="single" w:color="B7CFDA" w:sz="4"/>
-              <w:right w:val="single" w:color="B7CFDA" w:sz="4"/>
+              <w:top w:color="B7CFDA" w:sz="4" w:val="single"/>
+              <w:left w:color="B7CFDA" w:sz="4" w:val="single"/>
+              <w:bottom w:color="B7CFDA" w:sz="4" w:val="single"/>
+              <w:right w:color="B7CFDA" w:sz="4" w:val="single"/>
             </w:tcBorders>
             <w:shd w:fill="FFFFFF" w:val="clear"/>
             <w:tcMar>
@@ -1167,10 +1167,10 @@
           <w:tcPr>
             <w:tcW w:type="dxa" w:w="3350"/>
             <w:tcBorders>
-              <w:top w:val="single" w:color="B7CFDA" w:sz="4"/>
-              <w:left w:val="single" w:color="B7CFDA" w:sz="4"/>
-              <w:bottom w:val="single" w:color="B7CFDA" w:sz="4"/>
-              <w:right w:val="single" w:color="B7CFDA" w:sz="4"/>
+              <w:top w:color="B7CFDA" w:sz="4" w:val="single"/>
+              <w:left w:color="B7CFDA" w:sz="4" w:val="single"/>
+              <w:bottom w:color="B7CFDA" w:sz="4" w:val="single"/>
+              <w:right w:color="B7CFDA" w:sz="4" w:val="single"/>
             </w:tcBorders>
             <w:shd w:fill="FFFFFF" w:val="clear"/>
             <w:tcMar>
@@ -1202,10 +1202,10 @@
           <w:tcPr>
             <w:tcW w:type="dxa" w:w="2250"/>
             <w:tcBorders>
-              <w:top w:val="single" w:color="B7CFDA" w:sz="4"/>
-              <w:left w:val="single" w:color="B7CFDA" w:sz="4"/>
-              <w:bottom w:val="single" w:color="B7CFDA" w:sz="4"/>
-              <w:right w:val="single" w:color="B7CFDA" w:sz="4"/>
+              <w:top w:color="B7CFDA" w:sz="4" w:val="single"/>
+              <w:left w:color="B7CFDA" w:sz="4" w:val="single"/>
+              <w:bottom w:color="B7CFDA" w:sz="4" w:val="single"/>
+              <w:right w:color="B7CFDA" w:sz="4" w:val="single"/>
             </w:tcBorders>
             <w:shd w:fill="FFFFFF" w:val="clear"/>
             <w:tcMar>
@@ -1237,10 +1237,10 @@
           <w:tcPr>
             <w:tcW w:type="dxa" w:w="1926"/>
             <w:tcBorders>
-              <w:top w:val="single" w:color="B7CFDA" w:sz="4"/>
-              <w:left w:val="single" w:color="B7CFDA" w:sz="4"/>
-              <w:bottom w:val="single" w:color="B7CFDA" w:sz="4"/>
-              <w:right w:val="single" w:color="B7CFDA" w:sz="4"/>
+              <w:top w:color="B7CFDA" w:sz="4" w:val="single"/>
+              <w:left w:color="B7CFDA" w:sz="4" w:val="single"/>
+              <w:bottom w:color="B7CFDA" w:sz="4" w:val="single"/>
+              <w:right w:color="B7CFDA" w:sz="4" w:val="single"/>
             </w:tcBorders>
             <w:shd w:fill="FFF2CC" w:val="clear"/>
             <w:tcMar>
@@ -1275,10 +1275,10 @@
           <w:tcPr>
             <w:tcW w:type="dxa" w:w="1500"/>
             <w:tcBorders>
-              <w:top w:val="single" w:color="B7CFDA" w:sz="4"/>
-              <w:left w:val="single" w:color="B7CFDA" w:sz="4"/>
-              <w:bottom w:val="single" w:color="B7CFDA" w:sz="4"/>
-              <w:right w:val="single" w:color="B7CFDA" w:sz="4"/>
+              <w:top w:color="B7CFDA" w:sz="4" w:val="single"/>
+              <w:left w:color="B7CFDA" w:sz="4" w:val="single"/>
+              <w:bottom w:color="B7CFDA" w:sz="4" w:val="single"/>
+              <w:right w:color="B7CFDA" w:sz="4" w:val="single"/>
             </w:tcBorders>
             <w:shd w:fill="F4F8FB" w:val="clear"/>
             <w:tcMar>
@@ -1310,10 +1310,10 @@
           <w:tcPr>
             <w:tcW w:type="dxa" w:w="3350"/>
             <w:tcBorders>
-              <w:top w:val="single" w:color="B7CFDA" w:sz="4"/>
-              <w:left w:val="single" w:color="B7CFDA" w:sz="4"/>
-              <w:bottom w:val="single" w:color="B7CFDA" w:sz="4"/>
-              <w:right w:val="single" w:color="B7CFDA" w:sz="4"/>
+              <w:top w:color="B7CFDA" w:sz="4" w:val="single"/>
+              <w:left w:color="B7CFDA" w:sz="4" w:val="single"/>
+              <w:bottom w:color="B7CFDA" w:sz="4" w:val="single"/>
+              <w:right w:color="B7CFDA" w:sz="4" w:val="single"/>
             </w:tcBorders>
             <w:shd w:fill="F4F8FB" w:val="clear"/>
             <w:tcMar>
@@ -1345,10 +1345,10 @@
           <w:tcPr>
             <w:tcW w:type="dxa" w:w="2250"/>
             <w:tcBorders>
-              <w:top w:val="single" w:color="B7CFDA" w:sz="4"/>
-              <w:left w:val="single" w:color="B7CFDA" w:sz="4"/>
-              <w:bottom w:val="single" w:color="B7CFDA" w:sz="4"/>
-              <w:right w:val="single" w:color="B7CFDA" w:sz="4"/>
+              <w:top w:color="B7CFDA" w:sz="4" w:val="single"/>
+              <w:left w:color="B7CFDA" w:sz="4" w:val="single"/>
+              <w:bottom w:color="B7CFDA" w:sz="4" w:val="single"/>
+              <w:right w:color="B7CFDA" w:sz="4" w:val="single"/>
             </w:tcBorders>
             <w:shd w:fill="F4F8FB" w:val="clear"/>
             <w:tcMar>
@@ -1380,10 +1380,10 @@
           <w:tcPr>
             <w:tcW w:type="dxa" w:w="1926"/>
             <w:tcBorders>
-              <w:top w:val="single" w:color="B7CFDA" w:sz="4"/>
-              <w:left w:val="single" w:color="B7CFDA" w:sz="4"/>
-              <w:bottom w:val="single" w:color="B7CFDA" w:sz="4"/>
-              <w:right w:val="single" w:color="B7CFDA" w:sz="4"/>
+              <w:top w:color="B7CFDA" w:sz="4" w:val="single"/>
+              <w:left w:color="B7CFDA" w:sz="4" w:val="single"/>
+              <w:bottom w:color="B7CFDA" w:sz="4" w:val="single"/>
+              <w:right w:color="B7CFDA" w:sz="4" w:val="single"/>
             </w:tcBorders>
             <w:shd w:fill="FFF2CC" w:val="clear"/>
             <w:tcMar>
@@ -1418,10 +1418,10 @@
           <w:tcPr>
             <w:tcW w:type="dxa" w:w="1500"/>
             <w:tcBorders>
-              <w:top w:val="single" w:color="B7CFDA" w:sz="4"/>
-              <w:left w:val="single" w:color="B7CFDA" w:sz="4"/>
-              <w:bottom w:val="single" w:color="B7CFDA" w:sz="4"/>
-              <w:right w:val="single" w:color="B7CFDA" w:sz="4"/>
+              <w:top w:color="B7CFDA" w:sz="4" w:val="single"/>
+              <w:left w:color="B7CFDA" w:sz="4" w:val="single"/>
+              <w:bottom w:color="B7CFDA" w:sz="4" w:val="single"/>
+              <w:right w:color="B7CFDA" w:sz="4" w:val="single"/>
             </w:tcBorders>
             <w:shd w:fill="FFFFFF" w:val="clear"/>
             <w:tcMar>
@@ -1453,10 +1453,10 @@
           <w:tcPr>
             <w:tcW w:type="dxa" w:w="3350"/>
             <w:tcBorders>
-              <w:top w:val="single" w:color="B7CFDA" w:sz="4"/>
-              <w:left w:val="single" w:color="B7CFDA" w:sz="4"/>
-              <w:bottom w:val="single" w:color="B7CFDA" w:sz="4"/>
-              <w:right w:val="single" w:color="B7CFDA" w:sz="4"/>
+              <w:top w:color="B7CFDA" w:sz="4" w:val="single"/>
+              <w:left w:color="B7CFDA" w:sz="4" w:val="single"/>
+              <w:bottom w:color="B7CFDA" w:sz="4" w:val="single"/>
+              <w:right w:color="B7CFDA" w:sz="4" w:val="single"/>
             </w:tcBorders>
             <w:shd w:fill="FFFFFF" w:val="clear"/>
             <w:tcMar>
@@ -1488,10 +1488,10 @@
           <w:tcPr>
             <w:tcW w:type="dxa" w:w="2250"/>
             <w:tcBorders>
-              <w:top w:val="single" w:color="B7CFDA" w:sz="4"/>
-              <w:left w:val="single" w:color="B7CFDA" w:sz="4"/>
-              <w:bottom w:val="single" w:color="B7CFDA" w:sz="4"/>
-              <w:right w:val="single" w:color="B7CFDA" w:sz="4"/>
+              <w:top w:color="B7CFDA" w:sz="4" w:val="single"/>
+              <w:left w:color="B7CFDA" w:sz="4" w:val="single"/>
+              <w:bottom w:color="B7CFDA" w:sz="4" w:val="single"/>
+              <w:right w:color="B7CFDA" w:sz="4" w:val="single"/>
             </w:tcBorders>
             <w:shd w:fill="FFFFFF" w:val="clear"/>
             <w:tcMar>
@@ -1523,10 +1523,10 @@
           <w:tcPr>
             <w:tcW w:type="dxa" w:w="1926"/>
             <w:tcBorders>
-              <w:top w:val="single" w:color="B7CFDA" w:sz="4"/>
-              <w:left w:val="single" w:color="B7CFDA" w:sz="4"/>
-              <w:bottom w:val="single" w:color="B7CFDA" w:sz="4"/>
-              <w:right w:val="single" w:color="B7CFDA" w:sz="4"/>
+              <w:top w:color="B7CFDA" w:sz="4" w:val="single"/>
+              <w:left w:color="B7CFDA" w:sz="4" w:val="single"/>
+              <w:bottom w:color="B7CFDA" w:sz="4" w:val="single"/>
+              <w:right w:color="B7CFDA" w:sz="4" w:val="single"/>
             </w:tcBorders>
             <w:shd w:fill="FFF2CC" w:val="clear"/>
             <w:tcMar>
@@ -1561,10 +1561,10 @@
           <w:tcPr>
             <w:tcW w:type="dxa" w:w="1500"/>
             <w:tcBorders>
-              <w:top w:val="single" w:color="B7CFDA" w:sz="4"/>
-              <w:left w:val="single" w:color="B7CFDA" w:sz="4"/>
-              <w:bottom w:val="single" w:color="B7CFDA" w:sz="4"/>
-              <w:right w:val="single" w:color="B7CFDA" w:sz="4"/>
+              <w:top w:color="B7CFDA" w:sz="4" w:val="single"/>
+              <w:left w:color="B7CFDA" w:sz="4" w:val="single"/>
+              <w:bottom w:color="B7CFDA" w:sz="4" w:val="single"/>
+              <w:right w:color="B7CFDA" w:sz="4" w:val="single"/>
             </w:tcBorders>
             <w:shd w:fill="F4F8FB" w:val="clear"/>
             <w:tcMar>
@@ -1596,10 +1596,10 @@
           <w:tcPr>
             <w:tcW w:type="dxa" w:w="3350"/>
             <w:tcBorders>
-              <w:top w:val="single" w:color="B7CFDA" w:sz="4"/>
-              <w:left w:val="single" w:color="B7CFDA" w:sz="4"/>
-              <w:bottom w:val="single" w:color="B7CFDA" w:sz="4"/>
-              <w:right w:val="single" w:color="B7CFDA" w:sz="4"/>
+              <w:top w:color="B7CFDA" w:sz="4" w:val="single"/>
+              <w:left w:color="B7CFDA" w:sz="4" w:val="single"/>
+              <w:bottom w:color="B7CFDA" w:sz="4" w:val="single"/>
+              <w:right w:color="B7CFDA" w:sz="4" w:val="single"/>
             </w:tcBorders>
             <w:shd w:fill="F4F8FB" w:val="clear"/>
             <w:tcMar>
@@ -1631,10 +1631,10 @@
           <w:tcPr>
             <w:tcW w:type="dxa" w:w="2250"/>
             <w:tcBorders>
-              <w:top w:val="single" w:color="B7CFDA" w:sz="4"/>
-              <w:left w:val="single" w:color="B7CFDA" w:sz="4"/>
-              <w:bottom w:val="single" w:color="B7CFDA" w:sz="4"/>
-              <w:right w:val="single" w:color="B7CFDA" w:sz="4"/>
+              <w:top w:color="B7CFDA" w:sz="4" w:val="single"/>
+              <w:left w:color="B7CFDA" w:sz="4" w:val="single"/>
+              <w:bottom w:color="B7CFDA" w:sz="4" w:val="single"/>
+              <w:right w:color="B7CFDA" w:sz="4" w:val="single"/>
             </w:tcBorders>
             <w:shd w:fill="F4F8FB" w:val="clear"/>
             <w:tcMar>
@@ -1666,10 +1666,10 @@
           <w:tcPr>
             <w:tcW w:type="dxa" w:w="1926"/>
             <w:tcBorders>
-              <w:top w:val="single" w:color="B7CFDA" w:sz="4"/>
-              <w:left w:val="single" w:color="B7CFDA" w:sz="4"/>
-              <w:bottom w:val="single" w:color="B7CFDA" w:sz="4"/>
-              <w:right w:val="single" w:color="B7CFDA" w:sz="4"/>
+              <w:top w:color="B7CFDA" w:sz="4" w:val="single"/>
+              <w:left w:color="B7CFDA" w:sz="4" w:val="single"/>
+              <w:bottom w:color="B7CFDA" w:sz="4" w:val="single"/>
+              <w:right w:color="B7CFDA" w:sz="4" w:val="single"/>
             </w:tcBorders>
             <w:shd w:fill="FFF2CC" w:val="clear"/>
             <w:tcMar>
@@ -1736,9 +1736,9 @@
       </w:r>
     </w:p>
     <w:sectPr>
-      <w:footerReference w:type="default" r:id="rId7"/>
-      <w:pgSz w:w="11906" w:h="16838" w:orient="portrait"/>
-      <w:pgMar w:top="1000" w:right="1440" w:bottom="1100" w:left="1440" w:header="708" w:footer="708" w:gutter="0"/>
+      <w:footerReference xmlns:r="http://schemas.openxmlformats.org/officeDocument/2006/relationships" r:id="rId7" w:type="default"/>
+      <w:pgSz w:h="16838" w:orient="portrait" w:w="11906"/>
+      <w:pgMar w:bottom="1100" w:footer="708" w:gutter="0" w:header="708" w:left="1440" w:right="1440" w:top="1000"/>
       <w:pgNumType/>
       <w:docGrid w:linePitch="360"/>
     </w:sectPr>
@@ -1747,12 +1747,12 @@
 </file>
 
 <file path=word/comments.xml><?xml version="1.0" encoding="utf-8"?>
-<w:comments xmlns:cx="http://schemas.microsoft.com/office/drawing/2014/chartex" xmlns:cx1="http://schemas.microsoft.com/office/drawing/2015/9/8/chartex" xmlns:cx2="http://schemas.microsoft.com/office/drawing/2015/10/21/chartex" xmlns:cx3="http://schemas.microsoft.com/office/drawing/2016/5/9/chartex" xmlns:cx4="http://schemas.microsoft.com/office/drawing/2016/5/10/chartex" xmlns:cx5="http://schemas.microsoft.com/office/drawing/2016/5/11/chartex" xmlns:cx6="http://schemas.microsoft.com/office/drawing/2016/5/12/chartex" xmlns:cx7="http://schemas.microsoft.com/office/drawing/2016/5/13/chartex" xmlns:cx8="http://schemas.microsoft.com/office/drawing/2016/5/14/chartex" xmlns:mc="http://schemas.openxmlformats.org/markup-compatibility/2006" xmlns:aink="http://schemas.microsoft.com/office/drawing/2016/ink" xmlns:am3d="http://schemas.microsoft.com/office/drawing/2017/model3d" xmlns:o="urn:schemas-microsoft-com:office:office" xmlns:r="http://schemas.openxmlformats.org/officeDocument/2006/relationships" xmlns:m="http://schemas.openxmlformats.org/officeDocument/2006/math" xmlns:v="urn:schemas-microsoft-com:vml" xmlns:wp14="http://schemas.microsoft.com/office/word/2010/wordprocessingDrawing" xmlns:wp="http://schemas.openxmlformats.org/drawingml/2006/wordprocessingDrawing" xmlns:w10="urn:schemas-microsoft-com:office:word" xmlns:w="http://schemas.openxmlformats.org/wordprocessingml/2006/main" xmlns:w14="http://schemas.microsoft.com/office/word/2010/wordml" xmlns:w15="http://schemas.microsoft.com/office/word/2012/wordml" xmlns:w16cex="http://schemas.microsoft.com/office/word/2018/wordml/cex" xmlns:w16cid="http://schemas.microsoft.com/office/word/2016/wordml/cid" xmlns:w16="http://schemas.microsoft.com/office/word/2018/wordml" xmlns:w16sdtdh="http://schemas.microsoft.com/office/word/2020/wordml/sdtdatahash" xmlns:w16se="http://schemas.microsoft.com/office/word/2015/wordml/symex" xmlns:wpg="http://schemas.microsoft.com/office/word/2010/wordprocessingGroup" xmlns:wpi="http://schemas.microsoft.com/office/word/2010/wordprocessingInk" xmlns:wne="http://schemas.microsoft.com/office/word/2006/wordml" xmlns:wps="http://schemas.microsoft.com/office/word/2010/wordprocessingShape"/>
+<w:comments xmlns:w="http://schemas.openxmlformats.org/wordprocessingml/2006/main"/>
 </file>
 
 <file path=word/endnotes.xml><?xml version="1.0" encoding="utf-8"?>
-<w:endnotes xmlns:wpc="http://schemas.microsoft.com/office/word/2010/wordprocessingCanvas" xmlns:mc="http://schemas.openxmlformats.org/markup-compatibility/2006" xmlns:o="urn:schemas-microsoft-com:office:office" xmlns:r="http://schemas.openxmlformats.org/officeDocument/2006/relationships" xmlns:m="http://schemas.openxmlformats.org/officeDocument/2006/math" xmlns:v="urn:schemas-microsoft-com:vml" xmlns:wp14="http://schemas.microsoft.com/office/word/2010/wordprocessingDrawing" xmlns:wp="http://schemas.openxmlformats.org/drawingml/2006/wordprocessingDrawing" xmlns:w10="urn:schemas-microsoft-com:office:word" xmlns:w="http://schemas.openxmlformats.org/wordprocessingml/2006/main" xmlns:w14="http://schemas.microsoft.com/office/word/2010/wordml" xmlns:w15="http://schemas.microsoft.com/office/word/2012/wordml" xmlns:wpg="http://schemas.microsoft.com/office/word/2010/wordprocessingGroup" xmlns:wpi="http://schemas.microsoft.com/office/word/2010/wordprocessingInk" xmlns:wne="http://schemas.microsoft.com/office/word/2006/wordml" xmlns:wps="http://schemas.microsoft.com/office/word/2010/wordprocessingShape" mc:Ignorable="w14 w15 wp14">
-  <w:endnote w:type="separator" w:id="-1">
+<w:endnotes xmlns:mc="http://schemas.openxmlformats.org/markup-compatibility/2006" xmlns:w="http://schemas.openxmlformats.org/wordprocessingml/2006/main" mc:Ignorable="w14 w15 wp14">
+  <w:endnote w:id="-1" w:type="separator">
     <w:p>
       <w:pPr>
         <w:spacing w:after="0" w:line="240" w:lineRule="auto"/>
@@ -1768,7 +1768,7 @@
       </w:r>
     </w:p>
   </w:endnote>
-  <w:endnote w:type="continuationSeparator" w:id="0">
+  <w:endnote w:id="0" w:type="continuationSeparator">
     <w:p>
       <w:pPr>
         <w:spacing w:after="0" w:line="240" w:lineRule="auto"/>
@@ -1788,7 +1788,7 @@
 </file>
 
 <file path=word/footer1.xml><?xml version="1.0" encoding="utf-8"?>
-<w:ftr xmlns:wpc="http://schemas.microsoft.com/office/word/2010/wordprocessingCanvas" xmlns:mc="http://schemas.openxmlformats.org/markup-compatibility/2006" xmlns:o="urn:schemas-microsoft-com:office:office" xmlns:r="http://schemas.openxmlformats.org/officeDocument/2006/relationships" xmlns:m="http://schemas.openxmlformats.org/officeDocument/2006/math" xmlns:v="urn:schemas-microsoft-com:vml" xmlns:wp14="http://schemas.microsoft.com/office/word/2010/wordprocessingDrawing" xmlns:wp="http://schemas.openxmlformats.org/drawingml/2006/wordprocessingDrawing" xmlns:w10="urn:schemas-microsoft-com:office:word" xmlns:w="http://schemas.openxmlformats.org/wordprocessingml/2006/main" xmlns:w14="http://schemas.microsoft.com/office/word/2010/wordml" xmlns:w15="http://schemas.microsoft.com/office/word/2012/wordml" xmlns:wpg="http://schemas.microsoft.com/office/word/2010/wordprocessingGroup" xmlns:wpi="http://schemas.microsoft.com/office/word/2010/wordprocessingInk" xmlns:wne="http://schemas.microsoft.com/office/word/2006/wordml" xmlns:wps="http://schemas.microsoft.com/office/word/2010/wordprocessingShape">
+<w:ftr xmlns:w="http://schemas.openxmlformats.org/wordprocessingml/2006/main">
   <w:p>
     <w:pPr>
       <w:jc w:val="right"/>
@@ -1821,8 +1821,8 @@
 </file>
 
 <file path=word/footnotes.xml><?xml version="1.0" encoding="utf-8"?>
-<w:footnotes xmlns:wpc="http://schemas.microsoft.com/office/word/2010/wordprocessingCanvas" xmlns:mc="http://schemas.openxmlformats.org/markup-compatibility/2006" xmlns:o="urn:schemas-microsoft-com:office:office" xmlns:r="http://schemas.openxmlformats.org/officeDocument/2006/relationships" xmlns:m="http://schemas.openxmlformats.org/officeDocument/2006/math" xmlns:v="urn:schemas-microsoft-com:vml" xmlns:wp14="http://schemas.microsoft.com/office/word/2010/wordprocessingDrawing" xmlns:wp="http://schemas.openxmlformats.org/drawingml/2006/wordprocessingDrawing" xmlns:w10="urn:schemas-microsoft-com:office:word" xmlns:w="http://schemas.openxmlformats.org/wordprocessingml/2006/main" xmlns:w14="http://schemas.microsoft.com/office/word/2010/wordml" xmlns:w15="http://schemas.microsoft.com/office/word/2012/wordml" xmlns:wpg="http://schemas.microsoft.com/office/word/2010/wordprocessingGroup" xmlns:wpi="http://schemas.microsoft.com/office/word/2010/wordprocessingInk" xmlns:wne="http://schemas.microsoft.com/office/word/2006/wordml" xmlns:wps="http://schemas.microsoft.com/office/word/2010/wordprocessingShape" mc:Ignorable="w14 w15 wp14">
-  <w:footnote w:type="separator" w:id="-1">
+<w:footnotes xmlns:mc="http://schemas.openxmlformats.org/markup-compatibility/2006" xmlns:w="http://schemas.openxmlformats.org/wordprocessingml/2006/main" mc:Ignorable="w14 w15 wp14">
+  <w:footnote w:id="-1" w:type="separator">
     <w:p>
       <w:pPr>
         <w:spacing w:after="0" w:line="240" w:lineRule="auto"/>
@@ -1838,7 +1838,7 @@
       </w:r>
     </w:p>
   </w:footnote>
-  <w:footnote w:type="continuationSeparator" w:id="0">
+  <w:footnote w:id="0" w:type="continuationSeparator">
     <w:p>
       <w:pPr>
         <w:spacing w:after="0" w:line="240" w:lineRule="auto"/>
@@ -1858,88 +1858,88 @@
 </file>
 
 <file path=word/numbering.xml><?xml version="1.0" encoding="utf-8"?>
-<w:numbering xmlns:wpc="http://schemas.microsoft.com/office/word/2010/wordprocessingCanvas" xmlns:mc="http://schemas.openxmlformats.org/markup-compatibility/2006" xmlns:o="urn:schemas-microsoft-com:office:office" xmlns:r="http://schemas.openxmlformats.org/officeDocument/2006/relationships" xmlns:m="http://schemas.openxmlformats.org/officeDocument/2006/math" xmlns:v="urn:schemas-microsoft-com:vml" xmlns:wp14="http://schemas.microsoft.com/office/word/2010/wordprocessingDrawing" xmlns:wp="http://schemas.openxmlformats.org/drawingml/2006/wordprocessingDrawing" xmlns:w10="urn:schemas-microsoft-com:office:word" xmlns:w="http://schemas.openxmlformats.org/wordprocessingml/2006/main" xmlns:w14="http://schemas.microsoft.com/office/word/2010/wordml" xmlns:w15="http://schemas.microsoft.com/office/word/2012/wordml" xmlns:wpg="http://schemas.microsoft.com/office/word/2010/wordprocessingGroup" xmlns:wpi="http://schemas.microsoft.com/office/word/2010/wordprocessingInk" xmlns:wne="http://schemas.microsoft.com/office/word/2006/wordml" xmlns:wps="http://schemas.microsoft.com/office/word/2010/wordprocessingShape" mc:Ignorable="w14 w15 wp14">
-  <w:abstractNum w:abstractNumId="1" w15:restartNumberingAfterBreak="0">
+<w:numbering xmlns:mc="http://schemas.openxmlformats.org/markup-compatibility/2006" xmlns:w="http://schemas.openxmlformats.org/wordprocessingml/2006/main" mc:Ignorable="w14 w15 wp14">
+  <w:abstractNum xmlns:w15="http://schemas.microsoft.com/office/word/2012/wordml" w15:restartNumberingAfterBreak="0" w:abstractNumId="1">
     <w:multiLevelType w:val="hybridMultilevel"/>
-    <w:lvl w:ilvl="0" w15:tentative="1">
+    <w:lvl w15:tentative="1" w:ilvl="0">
       <w:start w:val="1"/>
       <w:numFmt w:val="bullet"/>
       <w:lvlText w:val="●"/>
       <w:lvlJc w:val="left"/>
       <w:pPr>
-        <w:ind w:left="720" w:hanging="360"/>
+        <w:ind w:hanging="360" w:left="720"/>
       </w:pPr>
     </w:lvl>
-    <w:lvl w:ilvl="1" w15:tentative="1">
+    <w:lvl w15:tentative="1" w:ilvl="1">
       <w:start w:val="1"/>
       <w:numFmt w:val="bullet"/>
       <w:lvlText w:val="○"/>
       <w:lvlJc w:val="left"/>
       <w:pPr>
-        <w:ind w:left="1440" w:hanging="360"/>
+        <w:ind w:hanging="360" w:left="1440"/>
       </w:pPr>
     </w:lvl>
-    <w:lvl w:ilvl="2" w15:tentative="1">
+    <w:lvl w15:tentative="1" w:ilvl="2">
       <w:start w:val="1"/>
       <w:numFmt w:val="bullet"/>
       <w:lvlText w:val="■"/>
       <w:lvlJc w:val="left"/>
       <w:pPr>
-        <w:ind w:left="2160" w:hanging="360"/>
+        <w:ind w:hanging="360" w:left="2160"/>
       </w:pPr>
     </w:lvl>
-    <w:lvl w:ilvl="3" w15:tentative="1">
+    <w:lvl w15:tentative="1" w:ilvl="3">
       <w:start w:val="1"/>
       <w:numFmt w:val="bullet"/>
       <w:lvlText w:val="●"/>
       <w:lvlJc w:val="left"/>
       <w:pPr>
-        <w:ind w:left="2880" w:hanging="360"/>
+        <w:ind w:hanging="360" w:left="2880"/>
       </w:pPr>
     </w:lvl>
-    <w:lvl w:ilvl="4" w15:tentative="1">
+    <w:lvl w15:tentative="1" w:ilvl="4">
       <w:start w:val="1"/>
       <w:numFmt w:val="bullet"/>
       <w:lvlText w:val="○"/>
       <w:lvlJc w:val="left"/>
       <w:pPr>
-        <w:ind w:left="3600" w:hanging="360"/>
+        <w:ind w:hanging="360" w:left="3600"/>
       </w:pPr>
     </w:lvl>
-    <w:lvl w:ilvl="5" w15:tentative="1">
+    <w:lvl w15:tentative="1" w:ilvl="5">
       <w:start w:val="1"/>
       <w:numFmt w:val="bullet"/>
       <w:lvlText w:val="■"/>
       <w:lvlJc w:val="left"/>
       <w:pPr>
-        <w:ind w:left="4320" w:hanging="360"/>
+        <w:ind w:hanging="360" w:left="4320"/>
       </w:pPr>
     </w:lvl>
-    <w:lvl w:ilvl="6" w15:tentative="1">
+    <w:lvl w15:tentative="1" w:ilvl="6">
       <w:start w:val="1"/>
       <w:numFmt w:val="bullet"/>
       <w:lvlText w:val="●"/>
       <w:lvlJc w:val="left"/>
       <w:pPr>
-        <w:ind w:left="5040" w:hanging="360"/>
+        <w:ind w:hanging="360" w:left="5040"/>
       </w:pPr>
     </w:lvl>
-    <w:lvl w:ilvl="7" w15:tentative="1">
+    <w:lvl w15:tentative="1" w:ilvl="7">
       <w:start w:val="1"/>
       <w:numFmt w:val="bullet"/>
       <w:lvlText w:val="●"/>
       <w:lvlJc w:val="left"/>
       <w:pPr>
-        <w:ind w:left="5760" w:hanging="360"/>
+        <w:ind w:hanging="360" w:left="5760"/>
       </w:pPr>
     </w:lvl>
-    <w:lvl w:ilvl="8" w15:tentative="1">
+    <w:lvl w15:tentative="1" w:ilvl="8">
       <w:start w:val="1"/>
       <w:numFmt w:val="bullet"/>
       <w:lvlText w:val="●"/>
       <w:lvlJc w:val="left"/>
       <w:pPr>
-        <w:ind w:left="6480" w:hanging="360"/>
+        <w:ind w:hanging="360" w:left="6480"/>
       </w:pPr>
     </w:lvl>
   </w:abstractNum>
@@ -1953,7 +1953,7 @@
 </file>
 
 <file path=word/styles.xml><?xml version="1.0" encoding="utf-8"?>
-<w:styles xmlns:mc="http://schemas.openxmlformats.org/markup-compatibility/2006" xmlns:r="http://schemas.openxmlformats.org/officeDocument/2006/relationships" xmlns:w="http://schemas.openxmlformats.org/wordprocessingml/2006/main" xmlns:w14="http://schemas.microsoft.com/office/word/2010/wordml" xmlns:w15="http://schemas.microsoft.com/office/word/2012/wordml" mc:Ignorable="w14 w15">
+<w:styles xmlns:mc="http://schemas.openxmlformats.org/markup-compatibility/2006" xmlns:w="http://schemas.openxmlformats.org/wordprocessingml/2006/main" mc:Ignorable="w14 w15">
   <w:docDefaults>
     <w:rPrDefault>
       <w:rPr>
@@ -1969,7 +1969,7 @@
       </w:pPr>
     </w:pPrDefault>
   </w:docDefaults>
-  <w:style w:type="paragraph" w:styleId="Title">
+  <w:style w:styleId="Title" w:type="paragraph">
     <w:name w:val="Title"/>
     <w:basedOn w:val="Normal"/>
     <w:next w:val="Normal"/>
@@ -1979,7 +1979,7 @@
       <w:szCs w:val="56"/>
     </w:rPr>
   </w:style>
-  <w:style w:type="paragraph" w:styleId="Heading1">
+  <w:style w:styleId="Heading1" w:type="paragraph">
     <w:name w:val="Heading 1"/>
     <w:basedOn w:val="Normal"/>
     <w:next w:val="Normal"/>
@@ -1990,7 +1990,7 @@
       <w:szCs w:val="32"/>
     </w:rPr>
   </w:style>
-  <w:style w:type="paragraph" w:styleId="Heading2">
+  <w:style w:styleId="Heading2" w:type="paragraph">
     <w:name w:val="Heading 2"/>
     <w:basedOn w:val="Normal"/>
     <w:next w:val="Normal"/>
@@ -2001,7 +2001,7 @@
       <w:szCs w:val="26"/>
     </w:rPr>
   </w:style>
-  <w:style w:type="paragraph" w:styleId="Heading3">
+  <w:style w:styleId="Heading3" w:type="paragraph">
     <w:name w:val="Heading 3"/>
     <w:basedOn w:val="Normal"/>
     <w:next w:val="Normal"/>
@@ -2012,7 +2012,7 @@
       <w:szCs w:val="24"/>
     </w:rPr>
   </w:style>
-  <w:style w:type="paragraph" w:styleId="Heading4">
+  <w:style w:styleId="Heading4" w:type="paragraph">
     <w:name w:val="Heading 4"/>
     <w:basedOn w:val="Normal"/>
     <w:next w:val="Normal"/>
@@ -2023,7 +2023,7 @@
       <w:color w:val="2E74B5"/>
     </w:rPr>
   </w:style>
-  <w:style w:type="paragraph" w:styleId="Heading5">
+  <w:style w:styleId="Heading5" w:type="paragraph">
     <w:name w:val="Heading 5"/>
     <w:basedOn w:val="Normal"/>
     <w:next w:val="Normal"/>
@@ -2032,7 +2032,7 @@
       <w:color w:val="2E74B5"/>
     </w:rPr>
   </w:style>
-  <w:style w:type="paragraph" w:styleId="Heading6">
+  <w:style w:styleId="Heading6" w:type="paragraph">
     <w:name w:val="Heading 6"/>
     <w:basedOn w:val="Normal"/>
     <w:next w:val="Normal"/>
@@ -2041,7 +2041,7 @@
       <w:color w:val="1F4D78"/>
     </w:rPr>
   </w:style>
-  <w:style w:type="paragraph" w:styleId="Strong">
+  <w:style w:styleId="Strong" w:type="paragraph">
     <w:name w:val="Strong"/>
     <w:basedOn w:val="Normal"/>
     <w:next w:val="Normal"/>
@@ -2051,12 +2051,12 @@
       <w:bCs/>
     </w:rPr>
   </w:style>
-  <w:style w:type="paragraph" w:styleId="ListParagraph">
+  <w:style w:styleId="ListParagraph" w:type="paragraph">
     <w:name w:val="List Paragraph"/>
     <w:basedOn w:val="Normal"/>
     <w:qFormat/>
   </w:style>
-  <w:style w:type="character" w:styleId="Hyperlink">
+  <w:style w:styleId="Hyperlink" w:type="character">
     <w:name w:val="Hyperlink"/>
     <w:basedOn w:val="DefaultParagraphFont"/>
     <w:uiPriority w:val="99"/>
@@ -2066,7 +2066,7 @@
       <w:u w:val="single"/>
     </w:rPr>
   </w:style>
-  <w:style w:type="character" w:styleId="FootnoteReference">
+  <w:style w:styleId="FootnoteReference" w:type="character">
     <w:name w:val="footnote reference"/>
     <w:basedOn w:val="DefaultParagraphFont"/>
     <w:uiPriority w:val="99"/>
@@ -2076,7 +2076,7 @@
       <w:vertAlign w:val="superscript"/>
     </w:rPr>
   </w:style>
-  <w:style w:type="paragraph" w:styleId="FootnoteText">
+  <w:style w:styleId="FootnoteText" w:type="paragraph">
     <w:name w:val="footnote text"/>
     <w:basedOn w:val="Normal"/>
     <w:link w:val="FootnoteTextChar"/>
@@ -2091,7 +2091,7 @@
       <w:szCs w:val="20"/>
     </w:rPr>
   </w:style>
-  <w:style w:type="character" w:styleId="FootnoteTextChar">
+  <w:style w:styleId="FootnoteTextChar" w:type="character">
     <w:name w:val="Footnote Text Char"/>
     <w:basedOn w:val="DefaultParagraphFont"/>
     <w:link w:val="FootnoteText"/>
@@ -2103,7 +2103,7 @@
       <w:szCs w:val="20"/>
     </w:rPr>
   </w:style>
-  <w:style w:type="character" w:styleId="EndnoteReference">
+  <w:style w:styleId="EndnoteReference" w:type="character">
     <w:name w:val="endnote reference"/>
     <w:basedOn w:val="DefaultParagraphFont"/>
     <w:uiPriority w:val="99"/>
@@ -2113,7 +2113,7 @@
       <w:vertAlign w:val="superscript"/>
     </w:rPr>
   </w:style>
-  <w:style w:type="paragraph" w:styleId="EndnoteText">
+  <w:style w:styleId="EndnoteText" w:type="paragraph">
     <w:name w:val="endnote text"/>
     <w:basedOn w:val="Normal"/>
     <w:link w:val="EndnoteTextChar"/>
@@ -2128,7 +2128,7 @@
       <w:szCs w:val="20"/>
     </w:rPr>
   </w:style>
-  <w:style w:type="character" w:styleId="EndnoteTextChar">
+  <w:style w:styleId="EndnoteTextChar" w:type="character">
     <w:name w:val="Endnote Text Char"/>
     <w:basedOn w:val="DefaultParagraphFont"/>
     <w:link w:val="EndnoteText"/>

</xml_diff>